<commit_message>
docs(v1.0.0): дата выпуска 1.0.0 — 30.10.2026
versions.md, CHANGELOG, описание процессов жизненного цикла для реестра (текущая версия и история
выпусков); PDF и DOCX истории версий и описания жизненного цикла пересобраны.
</commit_message>
<xml_diff>
--- a/docs/docx/registry/lifecycle.docx
+++ b/docs/docx/registry/lifecycle.docx
@@ -93,7 +93,7 @@
             </w:rPr>
             <w:fldChar w:fldCharType="separate"/>
           </w:r>
-          <w:hyperlink w:anchor="__RefHeading___Toc61583_1804324697">
+          <w:hyperlink w:anchor="__RefHeading___Toc3807_3459273207">
             <w:r>
               <w:rPr>
                 <w:webHidden/>
@@ -114,7 +114,7 @@
             </w:tabs>
             <w:rPr/>
           </w:pPr>
-          <w:hyperlink w:anchor="__RefHeading___Toc61585_1804324697">
+          <w:hyperlink w:anchor="__RefHeading___Toc3809_3459273207">
             <w:r>
               <w:rPr>
                 <w:webHidden/>
@@ -135,7 +135,7 @@
             </w:tabs>
             <w:rPr/>
           </w:pPr>
-          <w:hyperlink w:anchor="__RefHeading___Toc61587_1804324697">
+          <w:hyperlink w:anchor="__RefHeading___Toc3811_3459273207">
             <w:r>
               <w:rPr>
                 <w:webHidden/>
@@ -156,7 +156,7 @@
             </w:tabs>
             <w:rPr/>
           </w:pPr>
-          <w:hyperlink w:anchor="__RefHeading___Toc61589_1804324697">
+          <w:hyperlink w:anchor="__RefHeading___Toc3813_3459273207">
             <w:r>
               <w:rPr>
                 <w:webHidden/>
@@ -177,7 +177,7 @@
             </w:tabs>
             <w:rPr/>
           </w:pPr>
-          <w:hyperlink w:anchor="__RefHeading___Toc61591_1804324697">
+          <w:hyperlink w:anchor="__RefHeading___Toc3815_3459273207">
             <w:r>
               <w:rPr>
                 <w:webHidden/>
@@ -198,7 +198,7 @@
             </w:tabs>
             <w:rPr/>
           </w:pPr>
-          <w:hyperlink w:anchor="__RefHeading___Toc61593_1804324697">
+          <w:hyperlink w:anchor="__RefHeading___Toc3817_3459273207">
             <w:r>
               <w:rPr>
                 <w:webHidden/>
@@ -219,7 +219,7 @@
             </w:tabs>
             <w:rPr/>
           </w:pPr>
-          <w:hyperlink w:anchor="__RefHeading___Toc61595_1804324697">
+          <w:hyperlink w:anchor="__RefHeading___Toc3819_3459273207">
             <w:r>
               <w:rPr>
                 <w:webHidden/>
@@ -240,7 +240,7 @@
             </w:tabs>
             <w:rPr/>
           </w:pPr>
-          <w:hyperlink w:anchor="__RefHeading___Toc61597_1804324697">
+          <w:hyperlink w:anchor="__RefHeading___Toc3821_3459273207">
             <w:r>
               <w:rPr>
                 <w:webHidden/>
@@ -261,7 +261,7 @@
             </w:tabs>
             <w:rPr/>
           </w:pPr>
-          <w:hyperlink w:anchor="__RefHeading___Toc61599_1804324697">
+          <w:hyperlink w:anchor="__RefHeading___Toc3823_3459273207">
             <w:r>
               <w:rPr>
                 <w:webHidden/>
@@ -282,7 +282,7 @@
             </w:tabs>
             <w:rPr/>
           </w:pPr>
-          <w:hyperlink w:anchor="__RefHeading___Toc61601_1804324697">
+          <w:hyperlink w:anchor="__RefHeading___Toc3825_3459273207">
             <w:r>
               <w:rPr>
                 <w:webHidden/>
@@ -303,7 +303,7 @@
             </w:tabs>
             <w:rPr/>
           </w:pPr>
-          <w:hyperlink w:anchor="__RefHeading___Toc61603_1804324697">
+          <w:hyperlink w:anchor="__RefHeading___Toc3827_3459273207">
             <w:r>
               <w:rPr>
                 <w:webHidden/>
@@ -324,7 +324,7 @@
             </w:tabs>
             <w:rPr/>
           </w:pPr>
-          <w:hyperlink w:anchor="__RefHeading___Toc61605_1804324697">
+          <w:hyperlink w:anchor="__RefHeading___Toc3829_3459273207">
             <w:r>
               <w:rPr>
                 <w:webHidden/>
@@ -345,7 +345,7 @@
             </w:tabs>
             <w:rPr/>
           </w:pPr>
-          <w:hyperlink w:anchor="__RefHeading___Toc61607_1804324697">
+          <w:hyperlink w:anchor="__RefHeading___Toc3831_3459273207">
             <w:r>
               <w:rPr>
                 <w:webHidden/>
@@ -366,7 +366,7 @@
             </w:tabs>
             <w:rPr/>
           </w:pPr>
-          <w:hyperlink w:anchor="__RefHeading___Toc61609_1804324697">
+          <w:hyperlink w:anchor="__RefHeading___Toc3833_3459273207">
             <w:r>
               <w:rPr>
                 <w:webHidden/>
@@ -387,7 +387,7 @@
             </w:tabs>
             <w:rPr/>
           </w:pPr>
-          <w:hyperlink w:anchor="__RefHeading___Toc61611_1804324697">
+          <w:hyperlink w:anchor="__RefHeading___Toc3835_3459273207">
             <w:r>
               <w:rPr>
                 <w:webHidden/>
@@ -408,7 +408,7 @@
             </w:tabs>
             <w:rPr/>
           </w:pPr>
-          <w:hyperlink w:anchor="__RefHeading___Toc61613_1804324697">
+          <w:hyperlink w:anchor="__RefHeading___Toc3837_3459273207">
             <w:r>
               <w:rPr>
                 <w:webHidden/>
@@ -429,7 +429,7 @@
             </w:tabs>
             <w:rPr/>
           </w:pPr>
-          <w:hyperlink w:anchor="__RefHeading___Toc61615_1804324697">
+          <w:hyperlink w:anchor="__RefHeading___Toc3839_3459273207">
             <w:r>
               <w:rPr>
                 <w:webHidden/>
@@ -450,7 +450,7 @@
             </w:tabs>
             <w:rPr/>
           </w:pPr>
-          <w:hyperlink w:anchor="__RefHeading___Toc61617_1804324697">
+          <w:hyperlink w:anchor="__RefHeading___Toc3841_3459273207">
             <w:r>
               <w:rPr>
                 <w:webHidden/>
@@ -471,7 +471,7 @@
             </w:tabs>
             <w:rPr/>
           </w:pPr>
-          <w:hyperlink w:anchor="__RefHeading___Toc61619_1804324697">
+          <w:hyperlink w:anchor="__RefHeading___Toc3843_3459273207">
             <w:r>
               <w:rPr>
                 <w:webHidden/>
@@ -492,7 +492,7 @@
             </w:tabs>
             <w:rPr/>
           </w:pPr>
-          <w:hyperlink w:anchor="__RefHeading___Toc61621_1804324697">
+          <w:hyperlink w:anchor="__RefHeading___Toc3845_3459273207">
             <w:r>
               <w:rPr>
                 <w:webHidden/>
@@ -513,7 +513,7 @@
             </w:tabs>
             <w:rPr/>
           </w:pPr>
-          <w:hyperlink w:anchor="__RefHeading___Toc61623_1804324697">
+          <w:hyperlink w:anchor="__RefHeading___Toc3847_3459273207">
             <w:r>
               <w:rPr>
                 <w:webHidden/>
@@ -534,7 +534,7 @@
             </w:tabs>
             <w:rPr/>
           </w:pPr>
-          <w:hyperlink w:anchor="__RefHeading___Toc61625_1804324697">
+          <w:hyperlink w:anchor="__RefHeading___Toc3849_3459273207">
             <w:r>
               <w:rPr>
                 <w:webHidden/>
@@ -555,7 +555,7 @@
             </w:tabs>
             <w:rPr/>
           </w:pPr>
-          <w:hyperlink w:anchor="__RefHeading___Toc61627_1804324697">
+          <w:hyperlink w:anchor="__RefHeading___Toc3851_3459273207">
             <w:r>
               <w:rPr>
                 <w:webHidden/>
@@ -576,7 +576,7 @@
             </w:tabs>
             <w:rPr/>
           </w:pPr>
-          <w:hyperlink w:anchor="__RefHeading___Toc61629_1804324697">
+          <w:hyperlink w:anchor="__RefHeading___Toc3853_3459273207">
             <w:r>
               <w:rPr>
                 <w:webHidden/>
@@ -597,7 +597,7 @@
             </w:tabs>
             <w:rPr/>
           </w:pPr>
-          <w:hyperlink w:anchor="__RefHeading___Toc61631_1804324697">
+          <w:hyperlink w:anchor="__RefHeading___Toc3855_3459273207">
             <w:r>
               <w:rPr>
                 <w:webHidden/>
@@ -618,7 +618,7 @@
             </w:tabs>
             <w:rPr/>
           </w:pPr>
-          <w:hyperlink w:anchor="__RefHeading___Toc61633_1804324697">
+          <w:hyperlink w:anchor="__RefHeading___Toc3857_3459273207">
             <w:r>
               <w:rPr>
                 <w:webHidden/>
@@ -639,7 +639,7 @@
             </w:tabs>
             <w:rPr/>
           </w:pPr>
-          <w:hyperlink w:anchor="__RefHeading___Toc61635_1804324697">
+          <w:hyperlink w:anchor="__RefHeading___Toc3859_3459273207">
             <w:r>
               <w:rPr>
                 <w:webHidden/>
@@ -660,7 +660,7 @@
             </w:tabs>
             <w:rPr/>
           </w:pPr>
-          <w:hyperlink w:anchor="__RefHeading___Toc61637_1804324697">
+          <w:hyperlink w:anchor="__RefHeading___Toc3861_3459273207">
             <w:r>
               <w:rPr>
                 <w:webHidden/>
@@ -681,7 +681,7 @@
             </w:tabs>
             <w:rPr/>
           </w:pPr>
-          <w:hyperlink w:anchor="__RefHeading___Toc61639_1804324697">
+          <w:hyperlink w:anchor="__RefHeading___Toc3863_3459273207">
             <w:r>
               <w:rPr>
                 <w:webHidden/>
@@ -702,7 +702,7 @@
             </w:tabs>
             <w:rPr/>
           </w:pPr>
-          <w:hyperlink w:anchor="__RefHeading___Toc61641_1804324697">
+          <w:hyperlink w:anchor="__RefHeading___Toc3865_3459273207">
             <w:r>
               <w:rPr>
                 <w:webHidden/>
@@ -723,7 +723,7 @@
             </w:tabs>
             <w:rPr/>
           </w:pPr>
-          <w:hyperlink w:anchor="__RefHeading___Toc61643_1804324697">
+          <w:hyperlink w:anchor="__RefHeading___Toc3867_3459273207">
             <w:r>
               <w:rPr>
                 <w:webHidden/>
@@ -744,7 +744,7 @@
             </w:tabs>
             <w:rPr/>
           </w:pPr>
-          <w:hyperlink w:anchor="__RefHeading___Toc61645_1804324697">
+          <w:hyperlink w:anchor="__RefHeading___Toc3869_3459273207">
             <w:r>
               <w:rPr>
                 <w:webHidden/>
@@ -765,7 +765,7 @@
             </w:tabs>
             <w:rPr/>
           </w:pPr>
-          <w:hyperlink w:anchor="__RefHeading___Toc61647_1804324697">
+          <w:hyperlink w:anchor="__RefHeading___Toc3871_3459273207">
             <w:r>
               <w:rPr>
                 <w:webHidden/>
@@ -786,7 +786,7 @@
             </w:tabs>
             <w:rPr/>
           </w:pPr>
-          <w:hyperlink w:anchor="__RefHeading___Toc61649_1804324697">
+          <w:hyperlink w:anchor="__RefHeading___Toc3873_3459273207">
             <w:r>
               <w:rPr>
                 <w:webHidden/>
@@ -811,7 +811,7 @@
         <w:pStyle w:val="Heading1"/>
         <w:rPr/>
       </w:pPr>
-      <w:bookmarkStart w:id="0" w:name="__RefHeading___Toc61583_1804324697"/>
+      <w:bookmarkStart w:id="0" w:name="__RefHeading___Toc3807_3459273207"/>
       <w:bookmarkStart w:id="1" w:name="о-документе"/>
       <w:bookmarkEnd w:id="0"/>
       <w:r>
@@ -952,7 +952,7 @@
         <w:pStyle w:val="Heading1"/>
         <w:rPr/>
       </w:pPr>
-      <w:bookmarkStart w:id="2" w:name="__RefHeading___Toc61585_1804324697"/>
+      <w:bookmarkStart w:id="2" w:name="__RefHeading___Toc3809_3459273207"/>
       <w:bookmarkStart w:id="3" w:name="общие-сведения"/>
       <w:bookmarkEnd w:id="2"/>
       <w:r>
@@ -1196,17 +1196,7 @@
                 <w:szCs w:val="24"/>
                 <w:lang w:val="en-US" w:eastAsia="en-US" w:bidi="ar-SA"/>
               </w:rPr>
-              <w:t xml:space="preserve">1.0.0 от </w:t>
-            </w:r>
-            <w:r>
-              <w:rPr>
-                <w:rStyle w:val="VerbatimChar"/>
-                <w:kern w:val="0"/>
-                <w:sz w:val="18"/>
-                <w:szCs w:val="24"/>
-                <w:lang w:val="en-US" w:eastAsia="en-US" w:bidi="ar-SA"/>
-              </w:rPr>
-              <w:t>[заполняет правообладатель: дата выпуска]</w:t>
+              <w:t>1.0.0 от 30.10.2026</w:t>
             </w:r>
           </w:p>
         </w:tc>
@@ -1592,7 +1582,7 @@
         <w:pStyle w:val="Heading2"/>
         <w:rPr/>
       </w:pPr>
-      <w:bookmarkStart w:id="4" w:name="__RefHeading___Toc61587_1804324697"/>
+      <w:bookmarkStart w:id="4" w:name="__RefHeading___Toc3811_3459273207"/>
       <w:bookmarkEnd w:id="4"/>
       <w:r>
         <w:rPr>
@@ -2725,7 +2715,7 @@
         <w:pStyle w:val="Heading1"/>
         <w:rPr/>
       </w:pPr>
-      <w:bookmarkStart w:id="6" w:name="__RefHeading___Toc61589_1804324697"/>
+      <w:bookmarkStart w:id="6" w:name="__RefHeading___Toc3813_3459273207"/>
       <w:bookmarkStart w:id="7" w:name="разработка-и-совершенствование"/>
       <w:bookmarkEnd w:id="6"/>
       <w:r>
@@ -2745,7 +2735,7 @@
         <w:pStyle w:val="Heading2"/>
         <w:rPr/>
       </w:pPr>
-      <w:bookmarkStart w:id="8" w:name="__RefHeading___Toc61591_1804324697"/>
+      <w:bookmarkStart w:id="8" w:name="__RefHeading___Toc3815_3459273207"/>
       <w:bookmarkStart w:id="9" w:name="управление-требованиями"/>
       <w:bookmarkEnd w:id="8"/>
       <w:r>
@@ -2836,7 +2826,7 @@
         <w:pStyle w:val="Heading2"/>
         <w:rPr/>
       </w:pPr>
-      <w:bookmarkStart w:id="10" w:name="__RefHeading___Toc61593_1804324697"/>
+      <w:bookmarkStart w:id="10" w:name="__RefHeading___Toc3817_3459273207"/>
       <w:bookmarkStart w:id="11" w:name="проектирование"/>
       <w:bookmarkEnd w:id="10"/>
       <w:r>
@@ -2973,7 +2963,7 @@
         <w:pStyle w:val="Heading2"/>
         <w:rPr/>
       </w:pPr>
-      <w:bookmarkStart w:id="12" w:name="__RefHeading___Toc61595_1804324697"/>
+      <w:bookmarkStart w:id="12" w:name="__RefHeading___Toc3819_3459273207"/>
       <w:bookmarkStart w:id="13" w:name="разработка-с-применением-ии-ассистентов"/>
       <w:bookmarkEnd w:id="12"/>
       <w:r>
@@ -3614,7 +3604,7 @@
         <w:pStyle w:val="Heading2"/>
         <w:rPr/>
       </w:pPr>
-      <w:bookmarkStart w:id="14" w:name="__RefHeading___Toc61597_1804324697"/>
+      <w:bookmarkStart w:id="14" w:name="__RefHeading___Toc3821_3459273207"/>
       <w:bookmarkStart w:id="15" w:name="X0109297f1c16ad424b87e5c39ed26436f23e552"/>
       <w:bookmarkEnd w:id="14"/>
       <w:r>
@@ -4741,7 +4731,7 @@
         <w:pStyle w:val="Heading2"/>
         <w:rPr/>
       </w:pPr>
-      <w:bookmarkStart w:id="16" w:name="__RefHeading___Toc61599_1804324697"/>
+      <w:bookmarkStart w:id="16" w:name="__RefHeading___Toc3823_3459273207"/>
       <w:bookmarkEnd w:id="16"/>
       <w:r>
         <w:rPr>
@@ -5430,7 +5420,7 @@
         <w:pStyle w:val="Heading2"/>
         <w:rPr/>
       </w:pPr>
-      <w:bookmarkStart w:id="18" w:name="__RefHeading___Toc61601_1804324697"/>
+      <w:bookmarkStart w:id="18" w:name="__RefHeading___Toc3825_3459273207"/>
       <w:bookmarkEnd w:id="18"/>
       <w:r>
         <w:rPr>
@@ -5523,7 +5513,7 @@
         <w:pStyle w:val="Heading1"/>
         <w:rPr/>
       </w:pPr>
-      <w:bookmarkStart w:id="20" w:name="__RefHeading___Toc61603_1804324697"/>
+      <w:bookmarkStart w:id="20" w:name="__RefHeading___Toc3827_3459273207"/>
       <w:bookmarkStart w:id="21" w:name="тестирование"/>
       <w:bookmarkEnd w:id="20"/>
       <w:r>
@@ -5543,7 +5533,7 @@
         <w:pStyle w:val="Heading2"/>
         <w:rPr/>
       </w:pPr>
-      <w:bookmarkStart w:id="22" w:name="__RefHeading___Toc61605_1804324697"/>
+      <w:bookmarkStart w:id="22" w:name="__RefHeading___Toc3829_3459273207"/>
       <w:bookmarkStart w:id="23" w:name="автоматические-проверки"/>
       <w:bookmarkEnd w:id="22"/>
       <w:r>
@@ -6615,7 +6605,7 @@
         <w:pStyle w:val="Heading2"/>
         <w:rPr/>
       </w:pPr>
-      <w:bookmarkStart w:id="25" w:name="__RefHeading___Toc61607_1804324697"/>
+      <w:bookmarkStart w:id="25" w:name="__RefHeading___Toc3831_3459273207"/>
       <w:bookmarkStart w:id="26" w:name="проверка-обновления-на-данных"/>
       <w:bookmarkEnd w:id="25"/>
       <w:r>
@@ -6686,7 +6676,7 @@
         <w:pStyle w:val="Heading2"/>
         <w:rPr/>
       </w:pPr>
-      <w:bookmarkStart w:id="27" w:name="__RefHeading___Toc61609_1804324697"/>
+      <w:bookmarkStart w:id="27" w:name="__RefHeading___Toc3833_3459273207"/>
       <w:bookmarkStart w:id="28" w:name="нагрузочные-испытания"/>
       <w:bookmarkEnd w:id="27"/>
       <w:r>
@@ -7371,7 +7361,7 @@
         <w:pStyle w:val="Heading2"/>
         <w:rPr/>
       </w:pPr>
-      <w:bookmarkStart w:id="30" w:name="__RefHeading___Toc61611_1804324697"/>
+      <w:bookmarkStart w:id="30" w:name="__RefHeading___Toc3835_3459273207"/>
       <w:bookmarkStart w:id="31" w:name="ручное-и-приёмочное-тестирование"/>
       <w:bookmarkEnd w:id="30"/>
       <w:r>
@@ -7516,7 +7506,7 @@
         <w:pStyle w:val="Heading2"/>
         <w:rPr/>
       </w:pPr>
-      <w:bookmarkStart w:id="32" w:name="__RefHeading___Toc61613_1804324697"/>
+      <w:bookmarkStart w:id="32" w:name="__RefHeading___Toc3837_3459273207"/>
       <w:bookmarkStart w:id="33" w:name="регрессионные-тесты-на-дефекты"/>
       <w:bookmarkEnd w:id="32"/>
       <w:r>
@@ -7578,7 +7568,7 @@
         <w:pStyle w:val="Heading1"/>
         <w:rPr/>
       </w:pPr>
-      <w:bookmarkStart w:id="34" w:name="__RefHeading___Toc61615_1804324697"/>
+      <w:bookmarkStart w:id="34" w:name="__RefHeading___Toc3839_3459273207"/>
       <w:bookmarkStart w:id="35" w:name="выпуск-версий"/>
       <w:bookmarkEnd w:id="34"/>
       <w:r>
@@ -7598,7 +7588,7 @@
         <w:pStyle w:val="Heading2"/>
         <w:rPr/>
       </w:pPr>
-      <w:bookmarkStart w:id="36" w:name="__RefHeading___Toc61617_1804324697"/>
+      <w:bookmarkStart w:id="36" w:name="__RefHeading___Toc3841_3459273207"/>
       <w:bookmarkStart w:id="37" w:name="порядок-выпуска"/>
       <w:bookmarkEnd w:id="36"/>
       <w:r>
@@ -7827,7 +7817,7 @@
         <w:pStyle w:val="Heading2"/>
         <w:rPr/>
       </w:pPr>
-      <w:bookmarkStart w:id="38" w:name="__RefHeading___Toc61619_1804324697"/>
+      <w:bookmarkStart w:id="38" w:name="__RefHeading___Toc3843_3459273207"/>
       <w:bookmarkEnd w:id="38"/>
       <w:r>
         <w:rPr>
@@ -8444,7 +8434,7 @@
         <w:pStyle w:val="Heading2"/>
         <w:rPr/>
       </w:pPr>
-      <w:bookmarkStart w:id="40" w:name="__RefHeading___Toc61621_1804324697"/>
+      <w:bookmarkStart w:id="40" w:name="__RefHeading___Toc3845_3459273207"/>
       <w:bookmarkEnd w:id="40"/>
       <w:r>
         <w:rPr>
@@ -8650,13 +8640,12 @@
             </w:pPr>
             <w:r>
               <w:rPr>
-                <w:rStyle w:val="VerbatimChar"/>
-                <w:kern w:val="0"/>
-                <w:sz w:val="18"/>
-                <w:szCs w:val="24"/>
-                <w:lang w:val="en-US" w:eastAsia="en-US" w:bidi="ar-SA"/>
-              </w:rPr>
-              <w:t>[заполняет правообладатель]</w:t>
+                <w:kern w:val="0"/>
+                <w:sz w:val="18"/>
+                <w:szCs w:val="24"/>
+                <w:lang w:val="en-US" w:eastAsia="en-US" w:bidi="ar-SA"/>
+              </w:rPr>
+              <w:t>30.10.2026</w:t>
             </w:r>
           </w:p>
         </w:tc>
@@ -9445,7 +9434,7 @@
         <w:pStyle w:val="Heading1"/>
         <w:rPr/>
       </w:pPr>
-      <w:bookmarkStart w:id="41" w:name="__RefHeading___Toc61623_1804324697"/>
+      <w:bookmarkStart w:id="41" w:name="__RefHeading___Toc3847_3459273207"/>
       <w:bookmarkStart w:id="42" w:name="распространение-и-обновление"/>
       <w:bookmarkEnd w:id="41"/>
       <w:r>
@@ -9465,7 +9454,7 @@
         <w:pStyle w:val="Heading2"/>
         <w:rPr/>
       </w:pPr>
-      <w:bookmarkStart w:id="43" w:name="__RefHeading___Toc61625_1804324697"/>
+      <w:bookmarkStart w:id="43" w:name="__RefHeading___Toc3849_3459273207"/>
       <w:bookmarkEnd w:id="43"/>
       <w:r>
         <w:rPr>
@@ -10129,7 +10118,7 @@
         <w:pStyle w:val="Heading2"/>
         <w:rPr/>
       </w:pPr>
-      <w:bookmarkStart w:id="45" w:name="__RefHeading___Toc61627_1804324697"/>
+      <w:bookmarkStart w:id="45" w:name="__RefHeading___Toc3851_3459273207"/>
       <w:bookmarkEnd w:id="45"/>
       <w:r>
         <w:rPr>
@@ -10295,7 +10284,7 @@
         <w:pStyle w:val="Heading1"/>
         <w:rPr/>
       </w:pPr>
-      <w:bookmarkStart w:id="47" w:name="__RefHeading___Toc61629_1804324697"/>
+      <w:bookmarkStart w:id="47" w:name="__RefHeading___Toc3853_3459273207"/>
       <w:bookmarkStart w:id="48" w:name="устранение-неисправностей"/>
       <w:bookmarkEnd w:id="47"/>
       <w:r>
@@ -10315,7 +10304,7 @@
         <w:pStyle w:val="Heading2"/>
         <w:rPr/>
       </w:pPr>
-      <w:bookmarkStart w:id="49" w:name="__RefHeading___Toc61631_1804324697"/>
+      <w:bookmarkStart w:id="49" w:name="__RefHeading___Toc3855_3459273207"/>
       <w:bookmarkEnd w:id="49"/>
       <w:r>
         <w:rPr>
@@ -10866,7 +10855,7 @@
         <w:pStyle w:val="Heading2"/>
         <w:rPr/>
       </w:pPr>
-      <w:bookmarkStart w:id="51" w:name="__RefHeading___Toc61633_1804324697"/>
+      <w:bookmarkStart w:id="51" w:name="__RefHeading___Toc3857_3459273207"/>
       <w:bookmarkEnd w:id="51"/>
       <w:r>
         <w:rPr>
@@ -11611,7 +11600,7 @@
         <w:pStyle w:val="Heading2"/>
         <w:rPr/>
       </w:pPr>
-      <w:bookmarkStart w:id="52" w:name="__RefHeading___Toc61635_1804324697"/>
+      <w:bookmarkStart w:id="52" w:name="__RefHeading___Toc3859_3459273207"/>
       <w:bookmarkEnd w:id="52"/>
       <w:r>
         <w:rPr>
@@ -11768,7 +11757,7 @@
         <w:pStyle w:val="Heading2"/>
         <w:rPr/>
       </w:pPr>
-      <w:bookmarkStart w:id="53" w:name="__RefHeading___Toc61637_1804324697"/>
+      <w:bookmarkStart w:id="53" w:name="__RefHeading___Toc3861_3459273207"/>
       <w:bookmarkStart w:id="54" w:name="уязвимости"/>
       <w:bookmarkEnd w:id="53"/>
       <w:r>
@@ -11922,7 +11911,7 @@
         <w:pStyle w:val="Heading1"/>
         <w:rPr/>
       </w:pPr>
-      <w:bookmarkStart w:id="57" w:name="__RefHeading___Toc61639_1804324697"/>
+      <w:bookmarkStart w:id="57" w:name="__RefHeading___Toc3863_3459273207"/>
       <w:bookmarkEnd w:id="57"/>
       <w:r>
         <w:rPr>
@@ -12602,7 +12591,7 @@
         <w:pStyle w:val="Heading1"/>
         <w:rPr/>
       </w:pPr>
-      <w:bookmarkStart w:id="59" w:name="__RefHeading___Toc61641_1804324697"/>
+      <w:bookmarkStart w:id="59" w:name="__RefHeading___Toc3865_3459273207"/>
       <w:bookmarkEnd w:id="59"/>
       <w:r>
         <w:rPr>
@@ -12621,7 +12610,7 @@
         <w:pStyle w:val="Heading2"/>
         <w:rPr/>
       </w:pPr>
-      <w:bookmarkStart w:id="60" w:name="__RefHeading___Toc61643_1804324697"/>
+      <w:bookmarkStart w:id="60" w:name="__RefHeading___Toc3867_3459273207"/>
       <w:bookmarkStart w:id="61" w:name="персонал"/>
       <w:bookmarkEnd w:id="60"/>
       <w:r>
@@ -13652,7 +13641,7 @@
         <w:pStyle w:val="Heading2"/>
         <w:rPr/>
       </w:pPr>
-      <w:bookmarkStart w:id="62" w:name="__RefHeading___Toc61645_1804324697"/>
+      <w:bookmarkStart w:id="62" w:name="__RefHeading___Toc3869_3459273207"/>
       <w:bookmarkStart w:id="63" w:name="инфраструктура"/>
       <w:bookmarkEnd w:id="62"/>
       <w:r>
@@ -14175,7 +14164,7 @@
         <w:pStyle w:val="Heading1"/>
         <w:rPr/>
       </w:pPr>
-      <w:bookmarkStart w:id="65" w:name="__RefHeading___Toc61647_1804324697"/>
+      <w:bookmarkStart w:id="65" w:name="__RefHeading___Toc3871_3459273207"/>
       <w:bookmarkStart w:id="66" w:name="документация"/>
       <w:bookmarkEnd w:id="65"/>
       <w:r>
@@ -15371,7 +15360,7 @@
         <w:pStyle w:val="Heading1"/>
         <w:rPr/>
       </w:pPr>
-      <w:bookmarkStart w:id="67" w:name="__RefHeading___Toc61649_1804324697"/>
+      <w:bookmarkStart w:id="67" w:name="__RefHeading___Toc3873_3459273207"/>
       <w:bookmarkEnd w:id="67"/>
       <w:r>
         <w:rPr>

</xml_diff>